<commit_message>
fix: borders and strokes color
</commit_message>
<xml_diff>
--- a/Planung/Architekturdokumentation.docx
+++ b/Planung/Architekturdokumentation.docx
@@ -4,7 +4,7 @@
   <w:body>
     <w:p>
       <w:pPr>
-        <w:spacing w:before="360" w:after="360"/>
+        <w:spacing w:before="360" w:after="360" w:line="240" w:lineRule="auto"/>
         <w:jc w:val="center"/>
         <w:rPr>
           <w:b/>
@@ -14,7 +14,7 @@
     </w:p>
     <w:p>
       <w:pPr>
-        <w:spacing w:before="360" w:after="360"/>
+        <w:spacing w:before="360" w:after="360" w:line="240" w:lineRule="auto"/>
         <w:jc w:val="center"/>
         <w:rPr>
           <w:b/>
@@ -24,7 +24,7 @@
     </w:p>
     <w:p>
       <w:pPr>
-        <w:spacing w:before="360" w:after="360"/>
+        <w:spacing w:before="360" w:after="360" w:line="240" w:lineRule="auto"/>
         <w:jc w:val="center"/>
         <w:rPr>
           <w:b/>
@@ -34,7 +34,7 @@
     </w:p>
     <w:p>
       <w:pPr>
-        <w:spacing w:before="360" w:after="360"/>
+        <w:spacing w:before="360" w:after="360" w:line="240" w:lineRule="auto"/>
         <w:jc w:val="center"/>
         <w:rPr>
           <w:b/>
@@ -44,7 +44,7 @@
     </w:p>
     <w:p>
       <w:pPr>
-        <w:spacing w:before="360" w:after="360"/>
+        <w:spacing w:before="360" w:after="360" w:line="240" w:lineRule="auto"/>
         <w:jc w:val="center"/>
       </w:pPr>
       <w:r>
@@ -57,7 +57,7 @@
     </w:p>
     <w:p>
       <w:pPr>
-        <w:spacing w:after="480"/>
+        <w:spacing w:after="480" w:line="240" w:lineRule="auto"/>
         <w:jc w:val="center"/>
       </w:pPr>
       <w:r>
@@ -70,15 +70,18 @@
     </w:p>
     <w:p>
       <w:pPr>
-        <w:spacing w:after="0"/>
+        <w:spacing w:after="0" w:line="240" w:lineRule="auto"/>
       </w:pPr>
     </w:p>
     <w:p>
       <w:pPr>
-        <w:spacing w:after="0"/>
+        <w:spacing w:after="0" w:line="240" w:lineRule="auto"/>
       </w:pPr>
     </w:p>
     <w:p>
+      <w:pPr>
+        <w:spacing w:line="240" w:lineRule="auto"/>
+      </w:pPr>
       <w:r>
         <w:br w:type="page"/>
       </w:r>
@@ -98,16 +101,19 @@
       </w:r>
     </w:p>
     <w:p>
+      <w:pPr>
+        <w:spacing w:line="240" w:lineRule="auto"/>
+      </w:pPr>
       <w:r>
         <w:t>Diese Dokumentation beschreibt den Aufbau des Smart-Gardening-Systems und den Weg der Messdaten von den Sensoren bis zur Auswertung.</w:t>
       </w:r>
     </w:p>
     <w:p>
+      <w:pPr>
+        <w:spacing w:line="240" w:lineRule="auto"/>
+      </w:pPr>
       <w:r>
-        <w:t>Im Mittelpunkt stehen die</w:t>
-      </w:r>
-      <w:r>
-        <w:t xml:space="preserve"> InfluxDB, das FastAPI-Backend, das React-Frontend und die spätere Nutzung der Daten für Machine-Learning-Modelle.</w:t>
+        <w:t>Im Mittelpunkt stehen die InfluxDB, das FastAPI-Backend, das React-Frontend und die spätere Nutzung der Daten für Machine-Learning-Modelle.</w:t>
       </w:r>
     </w:p>
     <w:p>
@@ -137,56 +143,144 @@
       </w:r>
     </w:p>
     <w:p>
+      <w:pPr>
+        <w:spacing w:line="240" w:lineRule="auto"/>
+      </w:pPr>
       <w:r>
         <w:t>Der grundlegende Datenfluss des Systems ist:</w:t>
       </w:r>
     </w:p>
     <w:p>
       <w:pPr>
-        <w:spacing w:after="20"/>
-        <w:jc w:val="center"/>
+        <w:spacing w:line="240" w:lineRule="auto"/>
+      </w:pPr>
+    </w:p>
+    <w:p>
+      <w:pPr>
+        <w:spacing w:line="240" w:lineRule="auto"/>
+        <w:rPr>
+          <w:b/>
+        </w:rPr>
       </w:pPr>
       <w:r>
         <w:rPr>
           <w:b/>
         </w:rPr>
-        <w:t>Sensoren / ESP32-Sensor-Prototyp</w:t>
+        <w:t>Sensoren</w:t>
       </w:r>
     </w:p>
     <w:p>
       <w:pPr>
-        <w:spacing w:after="20"/>
-        <w:jc w:val="center"/>
+        <w:spacing w:line="240" w:lineRule="auto"/>
+        <w:rPr>
+          <w:rFonts w:hint="eastAsia"/>
+          <w:b/>
+        </w:rPr>
       </w:pPr>
       <w:r>
+        <w:rPr>
+          <w:rFonts w:hint="eastAsia"/>
+          <w:b/>
+        </w:rPr>
         <w:t>↓</w:t>
       </w:r>
     </w:p>
     <w:p>
       <w:pPr>
-        <w:spacing w:after="20"/>
-        <w:jc w:val="center"/>
+        <w:spacing w:line="240" w:lineRule="auto"/>
+        <w:rPr>
+          <w:b/>
+        </w:rPr>
       </w:pPr>
       <w:r>
         <w:rPr>
           <w:b/>
         </w:rPr>
-        <w:t>LoRaWAN / Datenübertragung</w:t>
+        <w:t>LoRaWAN / Gateway</w:t>
       </w:r>
     </w:p>
     <w:p>
       <w:pPr>
-        <w:spacing w:after="20"/>
-        <w:jc w:val="center"/>
+        <w:spacing w:line="240" w:lineRule="auto"/>
+        <w:rPr>
+          <w:rFonts w:hint="eastAsia"/>
+          <w:b/>
+        </w:rPr>
       </w:pPr>
       <w:r>
+        <w:rPr>
+          <w:rFonts w:hint="eastAsia"/>
+          <w:b/>
+        </w:rPr>
         <w:t>↓</w:t>
       </w:r>
     </w:p>
     <w:p>
       <w:pPr>
-        <w:spacing w:after="20"/>
-        <w:jc w:val="center"/>
+        <w:spacing w:line="240" w:lineRule="auto"/>
+        <w:rPr>
+          <w:b/>
+        </w:rPr>
+      </w:pPr>
+      <w:r>
+        <w:rPr>
+          <w:b/>
+        </w:rPr>
+        <w:t>MQTT-Broker (Mosquitto)</w:t>
+      </w:r>
+    </w:p>
+    <w:p>
+      <w:pPr>
+        <w:spacing w:line="240" w:lineRule="auto"/>
+        <w:rPr>
+          <w:rFonts w:hint="eastAsia"/>
+          <w:b/>
+        </w:rPr>
+      </w:pPr>
+      <w:r>
+        <w:rPr>
+          <w:rFonts w:hint="eastAsia"/>
+          <w:b/>
+        </w:rPr>
+        <w:t>↓</w:t>
+      </w:r>
+    </w:p>
+    <w:p>
+      <w:pPr>
+        <w:spacing w:line="240" w:lineRule="auto"/>
+        <w:rPr>
+          <w:b/>
+        </w:rPr>
+      </w:pPr>
+      <w:r>
+        <w:rPr>
+          <w:b/>
+        </w:rPr>
+        <w:t>Telegraf</w:t>
+      </w:r>
+    </w:p>
+    <w:p>
+      <w:pPr>
+        <w:spacing w:line="240" w:lineRule="auto"/>
+        <w:rPr>
+          <w:rFonts w:hint="eastAsia"/>
+          <w:b/>
+        </w:rPr>
+      </w:pPr>
+      <w:r>
+        <w:rPr>
+          <w:rFonts w:hint="eastAsia"/>
+          <w:b/>
+        </w:rPr>
+        <w:t>↓</w:t>
+      </w:r>
+    </w:p>
+    <w:p>
+      <w:pPr>
+        <w:spacing w:line="240" w:lineRule="auto"/>
+        <w:rPr>
+          <w:b/>
+        </w:rPr>
       </w:pPr>
       <w:r>
         <w:rPr>
@@ -197,64 +291,131 @@
     </w:p>
     <w:p>
       <w:pPr>
-        <w:spacing w:after="20"/>
-        <w:jc w:val="center"/>
+        <w:spacing w:line="240" w:lineRule="auto"/>
+        <w:rPr>
+          <w:rFonts w:hint="eastAsia"/>
+          <w:b/>
+        </w:rPr>
       </w:pPr>
       <w:r>
+        <w:rPr>
+          <w:rFonts w:hint="eastAsia"/>
+          <w:b/>
+        </w:rPr>
+        <w:t>├──</w:t>
+      </w:r>
+      <w:r>
+        <w:rPr>
+          <w:rFonts w:hint="eastAsia"/>
+          <w:b/>
+        </w:rPr>
+        <w:t xml:space="preserve"> Grafana (technisches Monitoring)</w:t>
+      </w:r>
+    </w:p>
+    <w:p>
+      <w:pPr>
+        <w:spacing w:line="240" w:lineRule="auto"/>
+        <w:rPr>
+          <w:rFonts w:hint="eastAsia"/>
+          <w:b/>
+        </w:rPr>
+      </w:pPr>
+      <w:r>
+        <w:rPr>
+          <w:rFonts w:hint="eastAsia"/>
+          <w:b/>
+        </w:rPr>
+        <w:t>└──</w:t>
+      </w:r>
+      <w:r>
+        <w:rPr>
+          <w:rFonts w:hint="eastAsia"/>
+          <w:b/>
+        </w:rPr>
+        <w:t xml:space="preserve"> FastAPI / DB-Connector</w:t>
+      </w:r>
+    </w:p>
+    <w:p>
+      <w:pPr>
+        <w:spacing w:line="240" w:lineRule="auto"/>
+        <w:ind w:left="720" w:firstLine="720"/>
+        <w:rPr>
+          <w:rFonts w:hint="eastAsia"/>
+          <w:b/>
+        </w:rPr>
+      </w:pPr>
+      <w:r>
+        <w:rPr>
+          <w:rFonts w:hint="eastAsia"/>
+          <w:b/>
+        </w:rPr>
         <w:t>↓</w:t>
       </w:r>
     </w:p>
     <w:p>
       <w:pPr>
-        <w:spacing w:after="20"/>
-        <w:jc w:val="center"/>
+        <w:spacing w:line="240" w:lineRule="auto"/>
+        <w:ind w:left="720" w:firstLine="720"/>
+        <w:rPr>
+          <w:b/>
+        </w:rPr>
       </w:pPr>
       <w:r>
         <w:rPr>
           <w:b/>
         </w:rPr>
-        <w:t>FastAPI-Backend / DB-Connector</w:t>
+        <w:t>React-Frontend</w:t>
       </w:r>
     </w:p>
     <w:p>
       <w:pPr>
-        <w:spacing w:after="20"/>
-        <w:jc w:val="center"/>
-      </w:pPr>
-      <w:r>
+        <w:spacing w:line="240" w:lineRule="auto"/>
         <w:rPr>
           <w:b/>
         </w:rPr>
-        <w:t xml:space="preserve">-&gt; </w:t>
+      </w:pPr>
+    </w:p>
+    <w:p>
+      <w:pPr>
+        <w:spacing w:line="240" w:lineRule="auto"/>
+      </w:pPr>
+    </w:p>
+    <w:p>
+      <w:pPr>
+        <w:spacing w:line="240" w:lineRule="auto"/>
+      </w:pPr>
+      <w:r>
+        <w:t>Die Messwerte werden von den Sensoren erfasst und über LoRaWAN übertragen. Der MQTT-Broker verteilt die empfangenen Nachrichten. Telegraf bereitet die Daten auf und schreibt sie in die InfluxDB.</w:t>
       </w:r>
       <w:r>
-        <w:rPr>
-          <w:b/>
-        </w:rPr>
-        <w:t>Frontend</w:t>
+        <w:t xml:space="preserve"> </w:t>
+      </w:r>
+      <w:r>
+        <w:t>Für das eigene Dashboard werden die Messwerte über das FastAPI-Backend aus der Datenbank gelesen. Grafana greift für technische Auswertungen direkt auf die InfluxDB zu.</w:t>
+      </w:r>
+      <w:r>
+        <w:t xml:space="preserve"> </w:t>
+      </w:r>
+      <w:r>
+        <w:t xml:space="preserve">Grafana ist ein separater Weg für internes Monitoring. </w:t>
       </w:r>
     </w:p>
     <w:p>
       <w:pPr>
-        <w:spacing w:after="20"/>
-        <w:jc w:val="center"/>
+        <w:spacing w:line="240" w:lineRule="auto"/>
       </w:pPr>
       <w:r>
-        <w:rPr>
-          <w:b/>
-        </w:rPr>
-        <w:t>-&gt; ML-Modell</w:t>
+        <w:t>Grafana darf direkt auf die InfluxDB zugreifen, ist aber nicht die Datenquelle für das Frontend oder das ML-Modell.</w:t>
       </w:r>
     </w:p>
     <w:p>
-      <w:r>
-        <w:t>Grafana ist ein separater Weg für internes Monitoring. Grafana darf direkt auf die InfluxDB zugreifen, ist aber nicht die Datenquelle für das Frontend oder das ML-Modell.</w:t>
-      </w:r>
+      <w:pPr>
+        <w:spacing w:line="240" w:lineRule="auto"/>
+      </w:pPr>
     </w:p>
     <w:p>
       <w:pPr>
-        <w:keepNext/>
-        <w:spacing w:before="200" w:line="240" w:lineRule="auto"/>
+        <w:spacing w:line="240" w:lineRule="auto"/>
       </w:pPr>
       <w:r>
         <w:rPr>
@@ -266,7 +427,7 @@
     </w:p>
     <w:p>
       <w:pPr>
-        <w:spacing w:after="60"/>
+        <w:spacing w:after="60" w:line="240" w:lineRule="auto"/>
         <w:ind w:left="312" w:hanging="181"/>
       </w:pPr>
       <w:r>
@@ -275,7 +436,7 @@
     </w:p>
     <w:p>
       <w:pPr>
-        <w:spacing w:after="60"/>
+        <w:spacing w:after="60" w:line="240" w:lineRule="auto"/>
         <w:ind w:left="312" w:hanging="181"/>
       </w:pPr>
       <w:r>
@@ -284,19 +445,17 @@
     </w:p>
     <w:p>
       <w:pPr>
-        <w:spacing w:after="60"/>
+        <w:spacing w:after="60" w:line="240" w:lineRule="auto"/>
         <w:ind w:left="312" w:hanging="181"/>
       </w:pPr>
       <w:r>
-        <w:t xml:space="preserve">• </w:t>
-      </w:r>
-      <w:r>
-        <w:t>Auch das ML-Modell soll historische Daten über das Backend bzw. eine dafür vorgesehene API erhalten.</w:t>
+        <w:lastRenderedPageBreak/>
+        <w:t>• Auch das ML-Modell soll historische Daten über das Backend bzw. eine dafür vorgesehene API erhalten.</w:t>
       </w:r>
     </w:p>
     <w:p>
       <w:pPr>
-        <w:spacing w:after="60"/>
+        <w:spacing w:after="60" w:line="240" w:lineRule="auto"/>
         <w:ind w:left="312" w:hanging="181"/>
       </w:pPr>
       <w:r>
@@ -330,11 +489,18 @@
       </w:r>
     </w:p>
     <w:p>
+      <w:pPr>
+        <w:spacing w:line="240" w:lineRule="auto"/>
+      </w:pPr>
       <w:r>
         <w:t>Die vorhandenen Bodensensoren erfassen Messwerte in den Versuchsbeeten. Zu den verwendeten Werten gehören Bodenfeuchte, Bodentemperatur, Leitwert (EC), Batteriespannung und Zeitstempel. Die Messdaten werden über die vorhandene LoRaWAN-Infrastruktur übertragen.</w:t>
       </w:r>
     </w:p>
-    <w:p/>
+    <w:p>
+      <w:pPr>
+        <w:spacing w:line="240" w:lineRule="auto"/>
+      </w:pPr>
+    </w:p>
     <w:p>
       <w:pPr>
         <w:keepNext/>
@@ -345,23 +511,21 @@
           <w:b/>
           <w:sz w:val="24"/>
         </w:rPr>
-        <w:lastRenderedPageBreak/>
-        <w:t>3</w:t>
-      </w:r>
-      <w:r>
-        <w:rPr>
-          <w:b/>
-          <w:sz w:val="24"/>
-        </w:rPr>
-        <w:t>.2. ESP32-Sensor-Prototyp</w:t>
+        <w:t>3.2. ESP32-Sensor-Prototyp</w:t>
       </w:r>
     </w:p>
     <w:p>
+      <w:pPr>
+        <w:spacing w:line="240" w:lineRule="auto"/>
+      </w:pPr>
       <w:r>
         <w:t>Parallel zu den vorhandenen Sensoren wird ein eigener Sensor-Prototyp mit einem ESP32 und verschiedenen Sensoren aufgebaut und getestet. Ziel ist ein eigener bzw. verbesserter Sensoraufbau.</w:t>
       </w:r>
     </w:p>
     <w:p>
+      <w:pPr>
+        <w:spacing w:line="240" w:lineRule="auto"/>
+      </w:pPr>
       <w:r>
         <w:t>Der Prototyp befindet sich noch im Test. Später sollen seine Messwerte möglichst über denselben Datenweg in der InfluxDB landen wie die bereits vorhandenen Sensordaten.</w:t>
       </w:r>
@@ -380,13 +544,16 @@
       </w:r>
     </w:p>
     <w:p>
+      <w:pPr>
+        <w:spacing w:line="240" w:lineRule="auto"/>
+      </w:pPr>
       <w:r>
         <w:t>Die InfluxDB wurde vom Projektteam eingerichtet und ist der zentrale Speicher für die Messdaten. Da es sich um zeitabhängige Sensorwerte handelt, werden Messwert und Zeitpunkt gemeinsam gespeichert.</w:t>
       </w:r>
     </w:p>
     <w:p>
       <w:pPr>
-        <w:spacing w:after="60"/>
+        <w:spacing w:after="60" w:line="240" w:lineRule="auto"/>
         <w:ind w:left="312" w:hanging="181"/>
       </w:pPr>
       <w:r>
@@ -395,19 +562,16 @@
     </w:p>
     <w:p>
       <w:pPr>
-        <w:spacing w:after="60"/>
+        <w:spacing w:after="60" w:line="240" w:lineRule="auto"/>
         <w:ind w:left="312" w:hanging="181"/>
       </w:pPr>
       <w:r>
-        <w:t xml:space="preserve">• </w:t>
-      </w:r>
-      <w:r>
-        <w:t>Messfelder werden für Bodenfeuchte, Bodentemperatur, Leitwert und Batteriespannung gespeichert.</w:t>
+        <w:t>• Messfelder werden für Bodenfeuchte, Bodentemperatur, Leitwert und Batteriespannung gespeichert.</w:t>
       </w:r>
     </w:p>
     <w:p>
       <w:pPr>
-        <w:spacing w:after="60"/>
+        <w:spacing w:after="60" w:line="240" w:lineRule="auto"/>
         <w:ind w:left="312" w:hanging="181"/>
       </w:pPr>
       <w:r>
@@ -428,11 +592,17 @@
       </w:r>
     </w:p>
     <w:p>
+      <w:pPr>
+        <w:spacing w:line="240" w:lineRule="auto"/>
+      </w:pPr>
       <w:r>
         <w:t>Der DB-Connector ist Teil des Backends. Er stellt die Verbindung zur InfluxDB her und führt die Datenbankabfragen aus. Zugangsdaten, Bucket, Organisation und Feldnamen werden über eine .env-Datei konfiguriert und liegen damit nicht im Frontend.</w:t>
       </w:r>
     </w:p>
     <w:p>
+      <w:pPr>
+        <w:spacing w:line="240" w:lineRule="auto"/>
+      </w:pPr>
       <w:r>
         <w:t>Für aktuelle Werte kann der Connector mehrere Sensoren gemeinsam abfragen. Fehlt ein Messwert, wird er als leerer Wert und nicht als 0 weitergegeben.</w:t>
       </w:r>
@@ -451,13 +621,41 @@
       </w:r>
     </w:p>
     <w:p>
+      <w:pPr>
+        <w:spacing w:line="240" w:lineRule="auto"/>
+      </w:pPr>
       <w:r>
         <w:t>Das Backend bildet die Schnittstelle zwischen Datenbank und den Anwendungen. Es fragt die InfluxDB über den DB-Connector ab und stellt die Ergebnisse als JSON über HTTP-Endpunkte bereit.</w:t>
       </w:r>
     </w:p>
     <w:p>
+      <w:pPr>
+        <w:spacing w:line="240" w:lineRule="auto"/>
+      </w:pPr>
       <w:r>
         <w:t>Zusätzlich ordnet das Backend die technischen Sensor-IDs den Beeten Carla, Berta und Ilse sowie den Positionen oben und unten zu. Dadurch muss das Frontend diese Zuordnung nicht selbst kennen.</w:t>
+      </w:r>
+    </w:p>
+    <w:p>
+      <w:pPr>
+        <w:keepNext/>
+        <w:spacing w:before="200" w:line="240" w:lineRule="auto"/>
+      </w:pPr>
+      <w:r>
+        <w:t>Zudem</w:t>
+      </w:r>
+      <w:r>
+        <w:t xml:space="preserve"> wurden Schnittstellen für historische Messwerte und die Anmeldung ergänzt. Historische Daten können für einzelne Beete oder für das gesamte Dashboard abgefragt werden.</w:t>
+      </w:r>
+      <w:r>
+        <w:t xml:space="preserve"> </w:t>
+      </w:r>
+      <w:r>
+        <w:t xml:space="preserve">Die </w:t>
+      </w:r>
+      <w:r>
+        <w:lastRenderedPageBreak/>
+        <w:t>Anmeldung wird über separate Authentifizierungsrouten umgesetzt. Benutzerinformationen werden in einem eigenen InfluxDB-Bucket gespeichert. Passwörter werden als Hash gespeichert. Nach erfolgreicher Anmeldung wird ein JWT zur Prüfung des Anmeldestatus verwendet.</w:t>
       </w:r>
     </w:p>
     <w:p>
@@ -474,18 +672,48 @@
       </w:r>
     </w:p>
     <w:p>
+      <w:pPr>
+        <w:keepNext/>
+        <w:spacing w:before="200" w:line="240" w:lineRule="auto"/>
+      </w:pPr>
       <w:r>
-        <w:t>Das Frontend besteht aus einer Landingpage und einem Dashboard. Das Dashboard ruft die aktuellen Messwerte über die Backend-API ab und stellt die Beete sowie deren Messwerte übersichtlich dar.</w:t>
+        <w:t>Das Frontend wurde mit React, TypeScript und Vite entwickelt. Es besteht inzwischen aus einer Landingpage, dem Dashboard, einer Login-Seite, einem internen Bereich und einer zusätzlichen Datenfluss-Visualisierung.</w:t>
       </w:r>
     </w:p>
     <w:p>
+      <w:pPr>
+        <w:keepNext/>
+        <w:spacing w:before="200" w:line="240" w:lineRule="auto"/>
+      </w:pPr>
       <w:r>
-        <w:t>Im aktuellen Stand werden die Dashboard-Daten beim Öffnen und anschließend alle 30 Sekunden neu abgerufen. Für Entwicklungs- und Demo-Zwecke sind zusätzlich lokale Beispieldaten vorhanden, falls das Backend nicht erreichbar ist.</w:t>
+        <w:t>Das Dashboard zeigt aktuelle Messwerte der Beete Carla, Berta und Ilse. Neben den einzelnen Beet-Karten gibt es eine Zusammenfassung und eine Vergleichstabelle. Die aktuellen Daten werden beim Aufruf und anschließend alle 15 Minuten über die Backend-API abgerufen. Falls das Backend nicht erreichbar ist, werden gekennzeichnete Beispieldaten angezeigt.</w:t>
       </w:r>
     </w:p>
     <w:p>
+      <w:pPr>
+        <w:keepNext/>
+        <w:spacing w:before="200" w:line="240" w:lineRule="auto"/>
+      </w:pPr>
       <w:r>
-        <w:t>Historische Daten sollen künftig ebenfalls über die Backend-API geladen und im eigenen React-Frontend als Diagramm dargestellt werden. Eine Grafana-Einbettung ist dafür nicht Teil der Zielarchitektur.</w:t>
+        <w:t>Für historische Daten gibt es eine neue Ansicht, die Messwerte über die Backend-API aus der InfluxDB lädt. Die Werte werden mit Recharts als Diagramme dargestellt. Benutzer können Beete, Messgrößen und Zeiträume auswählen. Die ältere Grafana-Ansicht ist im aktuellen Entwicklungsstand noch vorhanden.</w:t>
+      </w:r>
+    </w:p>
+    <w:p>
+      <w:pPr>
+        <w:keepNext/>
+        <w:spacing w:before="200" w:line="240" w:lineRule="auto"/>
+      </w:pPr>
+      <w:r>
+        <w:t>Die Anmeldung führt zu einem internen Bereich mit Verlinkungen zum Dashboard, zu Grafana und zu einer zusätzlichen Ansicht für Neles Versuchsfläche. Die Nele-Ansicht ist aktuell noch ein Platzhalter ohne eigene Messdaten.</w:t>
+      </w:r>
+    </w:p>
+    <w:p>
+      <w:pPr>
+        <w:keepNext/>
+        <w:spacing w:before="200" w:line="240" w:lineRule="auto"/>
+      </w:pPr>
+      <w:r>
+        <w:t>Eine weitere Seite stellt den Weg eines Messwerts vom Sensor bis zum Dashboard als interaktive Simulation dar. Die einzelnen Stationen können ausgewählt oder automatisch durchlaufen werden. Die angezeigten Messwerte sind Beispiele und stammen nicht aus einer Live-Abfrage.</w:t>
       </w:r>
     </w:p>
     <w:p>
@@ -498,16 +726,21 @@
           <w:b/>
           <w:sz w:val="24"/>
         </w:rPr>
-        <w:lastRenderedPageBreak/>
         <w:t>3.7. Machine Learning</w:t>
       </w:r>
     </w:p>
     <w:p>
+      <w:pPr>
+        <w:spacing w:line="240" w:lineRule="auto"/>
+      </w:pPr>
       <w:r>
         <w:t>Das ML-Modul verwendet historische Sensordaten für Auswertungen und spätere Vorhersagen. Die Daten sollen dafür über eine Backend-Schnittstelle aus der InfluxDB bereitgestellt werden.</w:t>
       </w:r>
     </w:p>
     <w:p>
+      <w:pPr>
+        <w:spacing w:line="240" w:lineRule="auto"/>
+      </w:pPr>
       <w:r>
         <w:t>Im Repository befindet sich noch ein früher Versuch, der Daten über die Grafana-Query-API abruft. Dieser Weg gehört nicht zur Zielarchitektur und soll durch den Zugriff über Backend und InfluxDB ersetzt werden.</w:t>
       </w:r>
@@ -526,6 +759,9 @@
       </w:r>
     </w:p>
     <w:p>
+      <w:pPr>
+        <w:spacing w:line="240" w:lineRule="auto"/>
+      </w:pPr>
       <w:r>
         <w:t>Grafana bleibt als technisches Werkzeug für internes Monitoring und Detailauswertungen bestehen. Es kann direkt auf die InfluxDB zugreifen. Grafana ist jedoch kein Vermittler zwischen Datenbank, Frontend und ML.</w:t>
       </w:r>
@@ -557,16 +793,25 @@
       </w:r>
     </w:p>
     <w:p>
+      <w:pPr>
+        <w:spacing w:line="240" w:lineRule="auto"/>
+      </w:pPr>
       <w:r>
         <w:t>1. Die Sensoren erfassen die Messwerte an den Versuchsbeeten.</w:t>
       </w:r>
     </w:p>
     <w:p>
+      <w:pPr>
+        <w:spacing w:line="240" w:lineRule="auto"/>
+      </w:pPr>
       <w:r>
         <w:t>2. Die Werte werden über LoRaWAN übertragen.</w:t>
       </w:r>
     </w:p>
     <w:p>
+      <w:pPr>
+        <w:spacing w:line="240" w:lineRule="auto"/>
+      </w:pPr>
       <w:r>
         <w:t>3. Die empfangenen Messdaten werden in der vom Projektteam eingerichteten InfluxDB gespeichert.</w:t>
       </w:r>
@@ -581,30 +826,46 @@
           <w:b/>
           <w:sz w:val="24"/>
         </w:rPr>
+        <w:lastRenderedPageBreak/>
         <w:t>4.2. Aktuelle Daten im Dashboard</w:t>
       </w:r>
     </w:p>
     <w:p>
+      <w:pPr>
+        <w:spacing w:line="240" w:lineRule="auto"/>
+      </w:pPr>
       <w:r>
         <w:t>1. Das Frontend sendet eine Anfrage an den Endpunkt /api/dashboard.</w:t>
       </w:r>
     </w:p>
     <w:p>
+      <w:pPr>
+        <w:spacing w:line="240" w:lineRule="auto"/>
+      </w:pPr>
       <w:r>
         <w:t>2. Das FastAPI-Backend ruft den DB-Connector auf.</w:t>
       </w:r>
     </w:p>
     <w:p>
+      <w:pPr>
+        <w:spacing w:line="240" w:lineRule="auto"/>
+      </w:pPr>
       <w:r>
         <w:t>3. Der DB-Connector liest die letzten Werte der bekannten Sensoren aus der InfluxDB.</w:t>
       </w:r>
     </w:p>
     <w:p>
+      <w:pPr>
+        <w:spacing w:line="240" w:lineRule="auto"/>
+      </w:pPr>
       <w:r>
         <w:t>4. Das Backend ergänzt Beet, Position und Substrat und liefert die Daten als JSON zurück.</w:t>
       </w:r>
     </w:p>
     <w:p>
+      <w:pPr>
+        <w:spacing w:line="240" w:lineRule="auto"/>
+      </w:pPr>
       <w:r>
         <w:t>5. Das React-Frontend stellt die Werte in Karten und Vergleichsansichten dar.</w:t>
       </w:r>
@@ -623,8 +884,24 @@
       </w:r>
     </w:p>
     <w:p>
+      <w:pPr>
+        <w:keepNext/>
+        <w:spacing w:before="200" w:line="240" w:lineRule="auto"/>
+      </w:pPr>
       <w:r>
-        <w:t>Für historische Verläufe ist eine eigene Backend-Schnittstelle vorgesehen. Das Frontend übergibt Sensor, Messwert und Zeitraum an das Backend. Das Backend liest die entsprechende Zeitreihe aus der InfluxDB und liefert Zeitstempel und Werte zurück. Das Diagramm wird anschließend im React-Frontend erzeugt.</w:t>
+        <w:t>Historische Messwerte werden über die FastAPI-Schnittstelle aus der InfluxDB geladen. Das Frontend kann mehrere Beete, Messgrößen und Zeiträume auswählen.</w:t>
+      </w:r>
+      <w:r>
+        <w:t xml:space="preserve"> </w:t>
+      </w:r>
+      <w:r>
+        <w:t>Für größere Zeiträume können die Daten in mehreren Abschnitten geladen werden. Die Ergebnisse werden schrittweise im Diagramm dargestellt. Bereits geladene Daten werden während der laufenden Anwendung zwischengespeichert, um doppelte Abfragen zu reduzieren.</w:t>
+      </w:r>
+      <w:r>
+        <w:t xml:space="preserve"> </w:t>
+      </w:r>
+      <w:r>
+        <w:t>Die Diagramme werden direkt im React-Frontend mit Recharts erstellt. Eine Grafana-Einbettung ist dafür nicht notwendig.</w:t>
       </w:r>
     </w:p>
     <w:p>
@@ -641,6 +918,9 @@
       </w:r>
     </w:p>
     <w:p>
+      <w:pPr>
+        <w:spacing w:line="240" w:lineRule="auto"/>
+      </w:pPr>
       <w:r>
         <w:t>Das ML-Modell erhält seine Trainings- und Auswertungsdaten ebenfalls über eine Backend-Schnittstelle. Damit greifen Frontend und ML auf dieselbe Datenbasis und dieselbe Zuordnung der Sensoren zurück.</w:t>
       </w:r>
@@ -659,6 +939,9 @@
       </w:r>
     </w:p>
     <w:p>
+      <w:pPr>
+        <w:spacing w:line="240" w:lineRule="auto"/>
+      </w:pPr>
       <w:r>
         <w:t>Grafana greift für internes Monitoring separat auf die InfluxDB zu. Dieser Weg beeinflusst die Datenversorgung von Frontend und ML nicht.</w:t>
       </w:r>
@@ -666,6 +949,107 @@
     <w:p>
       <w:pPr>
         <w:keepNext/>
+        <w:spacing w:before="200" w:line="240" w:lineRule="auto"/>
+      </w:pPr>
+      <w:r>
+        <w:rPr>
+          <w:b/>
+          <w:sz w:val="24"/>
+        </w:rPr>
+        <w:t>4.</w:t>
+      </w:r>
+      <w:r>
+        <w:rPr>
+          <w:b/>
+          <w:sz w:val="24"/>
+        </w:rPr>
+        <w:t>6</w:t>
+      </w:r>
+      <w:r>
+        <w:rPr>
+          <w:b/>
+          <w:sz w:val="24"/>
+        </w:rPr>
+        <w:t xml:space="preserve">. </w:t>
+      </w:r>
+      <w:r>
+        <w:rPr>
+          <w:b/>
+          <w:sz w:val="24"/>
+        </w:rPr>
+        <w:t>Anmeldung und interner Bereich</w:t>
+      </w:r>
+    </w:p>
+    <w:p>
+      <w:pPr>
+        <w:spacing w:line="240" w:lineRule="auto"/>
+      </w:pPr>
+      <w:r>
+        <w:t>Benutzer melden sich über die Login-Seite mit Benutzername und Passwort an. Das Backend prüft die Zugangsdaten und erstellt bei erfolgreicher Anmeldung ein Token.</w:t>
+      </w:r>
+      <w:r>
+        <w:t xml:space="preserve"> </w:t>
+      </w:r>
+    </w:p>
+    <w:p>
+      <w:pPr>
+        <w:spacing w:line="240" w:lineRule="auto"/>
+      </w:pPr>
+      <w:r>
+        <w:t>Das Frontend überprüft den Anmeldestatus beim Aufrufen interner Seiten. Nicht angemeldete Benutzer werden zur Login-Seite weitergeleitet. Über die Abmeldefunktion wird die Sitzung beendet.</w:t>
+      </w:r>
+    </w:p>
+    <w:p>
+      <w:pPr>
+        <w:keepNext/>
+        <w:spacing w:before="200" w:line="240" w:lineRule="auto"/>
+      </w:pPr>
+      <w:r>
+        <w:rPr>
+          <w:b/>
+          <w:sz w:val="24"/>
+        </w:rPr>
+        <w:t>4.</w:t>
+      </w:r>
+      <w:r>
+        <w:rPr>
+          <w:b/>
+          <w:sz w:val="24"/>
+        </w:rPr>
+        <w:t>7</w:t>
+      </w:r>
+      <w:r>
+        <w:rPr>
+          <w:b/>
+          <w:sz w:val="24"/>
+        </w:rPr>
+        <w:t>. Anmeldung und interner Bereich</w:t>
+      </w:r>
+    </w:p>
+    <w:p>
+      <w:pPr>
+        <w:spacing w:line="240" w:lineRule="auto"/>
+      </w:pPr>
+      <w:r>
+        <w:t>Die Datenflussseite erklärt den technischen Aufbau des Systems anhand einer Simulation. Sie zeigt acht Stationen vom Dragino-Sensor über LoRaWAN, Mosquitto, Telegraf und InfluxDB bis zu Grafana, FastAPI und dem Dashboard.</w:t>
+      </w:r>
+    </w:p>
+    <w:p>
+      <w:pPr>
+        <w:spacing w:line="240" w:lineRule="auto"/>
+      </w:pPr>
+      <w:r>
+        <w:t>Die Visualisierung wurde als eigene React-Komponente mit SVG umgesetzt. Der Benutzer kann die Stationen einzeln auswählen oder die Simulation automatisch abspielen. Die Darstellung verwendet Beispieldaten und dient nur zur Erklärung der Architektur.</w:t>
+      </w:r>
+    </w:p>
+    <w:p>
+      <w:pPr>
+        <w:spacing w:line="240" w:lineRule="auto"/>
+      </w:pPr>
+    </w:p>
+    <w:p>
+      <w:pPr>
+        <w:keepNext/>
         <w:spacing w:before="280" w:after="160" w:line="240" w:lineRule="auto"/>
       </w:pPr>
       <w:r>
@@ -673,7 +1057,6 @@
           <w:b/>
           <w:sz w:val="28"/>
         </w:rPr>
-        <w:lastRenderedPageBreak/>
         <w:t>5. Daten und Zuordnung</w:t>
       </w:r>
     </w:p>
@@ -830,6 +1213,7 @@
               <w:spacing w:after="0" w:line="240" w:lineRule="auto"/>
             </w:pPr>
             <w:r>
+              <w:lastRenderedPageBreak/>
               <w:t>Carla</w:t>
             </w:r>
           </w:p>
@@ -1070,7 +1454,7 @@
     </w:tbl>
     <w:p>
       <w:pPr>
-        <w:spacing w:after="0"/>
+        <w:spacing w:after="0" w:line="240" w:lineRule="auto"/>
       </w:pPr>
     </w:p>
     <w:p>
@@ -1514,7 +1898,7 @@
     </w:tbl>
     <w:p>
       <w:pPr>
-        <w:spacing w:after="0"/>
+        <w:spacing w:after="0" w:line="240" w:lineRule="auto"/>
       </w:pPr>
     </w:p>
     <w:p>
@@ -1531,13 +1915,16 @@
       </w:r>
     </w:p>
     <w:p>
+      <w:pPr>
+        <w:spacing w:line="240" w:lineRule="auto"/>
+      </w:pPr>
       <w:r>
         <w:t>Die API bildet die feste Schnittstelle zwischen Datenbank und den weiteren Programmteilen. Vorhandene und geplante Endpunkte sind:</w:t>
       </w:r>
     </w:p>
     <w:tbl>
       <w:tblPr>
-        <w:tblW w:w="0" w:type="auto"/>
+        <w:tblW w:w="9915" w:type="dxa"/>
         <w:jc w:val="center"/>
         <w:tblBorders>
           <w:top w:val="single" w:sz="6" w:space="0" w:color="000000"/>
@@ -1551,18 +1938,19 @@
         <w:tblLook w:val="04A0" w:firstRow="1" w:lastRow="0" w:firstColumn="1" w:lastColumn="0" w:noHBand="0" w:noVBand="1"/>
       </w:tblPr>
       <w:tblGrid>
-        <w:gridCol w:w="3402"/>
-        <w:gridCol w:w="4139"/>
-        <w:gridCol w:w="1757"/>
+        <w:gridCol w:w="3820"/>
+        <w:gridCol w:w="4114"/>
+        <w:gridCol w:w="1981"/>
       </w:tblGrid>
       <w:tr>
         <w:trPr>
           <w:cantSplit/>
+          <w:trHeight w:val="255"/>
           <w:jc w:val="center"/>
         </w:trPr>
         <w:tc>
           <w:tcPr>
-            <w:tcW w:w="3402" w:type="dxa"/>
+            <w:tcW w:w="3820" w:type="dxa"/>
             <w:tcMar>
               <w:top w:w="70" w:type="dxa"/>
               <w:left w:w="90" w:type="dxa"/>
@@ -1585,7 +1973,7 @@
         </w:tc>
         <w:tc>
           <w:tcPr>
-            <w:tcW w:w="4139" w:type="dxa"/>
+            <w:tcW w:w="4114" w:type="dxa"/>
             <w:tcMar>
               <w:top w:w="70" w:type="dxa"/>
               <w:left w:w="90" w:type="dxa"/>
@@ -1608,7 +1996,7 @@
         </w:tc>
         <w:tc>
           <w:tcPr>
-            <w:tcW w:w="1757" w:type="dxa"/>
+            <w:tcW w:w="1981" w:type="dxa"/>
             <w:tcMar>
               <w:top w:w="70" w:type="dxa"/>
               <w:left w:w="90" w:type="dxa"/>
@@ -1633,11 +2021,12 @@
       <w:tr>
         <w:trPr>
           <w:cantSplit/>
+          <w:trHeight w:val="270"/>
           <w:jc w:val="center"/>
         </w:trPr>
         <w:tc>
           <w:tcPr>
-            <w:tcW w:w="3402" w:type="dxa"/>
+            <w:tcW w:w="3820" w:type="dxa"/>
             <w:tcMar>
               <w:top w:w="70" w:type="dxa"/>
               <w:left w:w="90" w:type="dxa"/>
@@ -1657,7 +2046,7 @@
         </w:tc>
         <w:tc>
           <w:tcPr>
-            <w:tcW w:w="4139" w:type="dxa"/>
+            <w:tcW w:w="4114" w:type="dxa"/>
             <w:tcMar>
               <w:top w:w="70" w:type="dxa"/>
               <w:left w:w="90" w:type="dxa"/>
@@ -1677,7 +2066,7 @@
         </w:tc>
         <w:tc>
           <w:tcPr>
-            <w:tcW w:w="1757" w:type="dxa"/>
+            <w:tcW w:w="1981" w:type="dxa"/>
             <w:tcMar>
               <w:top w:w="70" w:type="dxa"/>
               <w:left w:w="90" w:type="dxa"/>
@@ -1699,11 +2088,12 @@
       <w:tr>
         <w:trPr>
           <w:cantSplit/>
+          <w:trHeight w:val="255"/>
           <w:jc w:val="center"/>
         </w:trPr>
         <w:tc>
           <w:tcPr>
-            <w:tcW w:w="3402" w:type="dxa"/>
+            <w:tcW w:w="3820" w:type="dxa"/>
             <w:tcMar>
               <w:top w:w="70" w:type="dxa"/>
               <w:left w:w="90" w:type="dxa"/>
@@ -1723,7 +2113,7 @@
         </w:tc>
         <w:tc>
           <w:tcPr>
-            <w:tcW w:w="4139" w:type="dxa"/>
+            <w:tcW w:w="4114" w:type="dxa"/>
             <w:tcMar>
               <w:top w:w="70" w:type="dxa"/>
               <w:left w:w="90" w:type="dxa"/>
@@ -1743,7 +2133,7 @@
         </w:tc>
         <w:tc>
           <w:tcPr>
-            <w:tcW w:w="1757" w:type="dxa"/>
+            <w:tcW w:w="1981" w:type="dxa"/>
             <w:tcMar>
               <w:top w:w="70" w:type="dxa"/>
               <w:left w:w="90" w:type="dxa"/>
@@ -1765,11 +2155,12 @@
       <w:tr>
         <w:trPr>
           <w:cantSplit/>
+          <w:trHeight w:val="270"/>
           <w:jc w:val="center"/>
         </w:trPr>
         <w:tc>
           <w:tcPr>
-            <w:tcW w:w="3402" w:type="dxa"/>
+            <w:tcW w:w="3820" w:type="dxa"/>
             <w:tcMar>
               <w:top w:w="70" w:type="dxa"/>
               <w:left w:w="90" w:type="dxa"/>
@@ -1783,13 +2174,16 @@
               <w:spacing w:after="0" w:line="240" w:lineRule="auto"/>
             </w:pPr>
             <w:r>
-              <w:t>GET /api/beds/{beet}/{position}</w:t>
+              <w:t>GET /api/dashboard</w:t>
+            </w:r>
+            <w:r>
+              <w:t>/history</w:t>
             </w:r>
           </w:p>
         </w:tc>
         <w:tc>
           <w:tcPr>
-            <w:tcW w:w="4139" w:type="dxa"/>
+            <w:tcW w:w="4114" w:type="dxa"/>
             <w:tcMar>
               <w:top w:w="70" w:type="dxa"/>
               <w:left w:w="90" w:type="dxa"/>
@@ -1803,13 +2197,13 @@
               <w:spacing w:after="0" w:line="240" w:lineRule="auto"/>
             </w:pPr>
             <w:r>
-              <w:t>Einzelne Messstelle ausgeben</w:t>
+              <w:t>Aktuelle Daten für das Dashboard</w:t>
             </w:r>
           </w:p>
         </w:tc>
         <w:tc>
           <w:tcPr>
-            <w:tcW w:w="1757" w:type="dxa"/>
+            <w:tcW w:w="1981" w:type="dxa"/>
             <w:tcMar>
               <w:top w:w="70" w:type="dxa"/>
               <w:left w:w="90" w:type="dxa"/>
@@ -1831,11 +2225,12 @@
       <w:tr>
         <w:trPr>
           <w:cantSplit/>
+          <w:trHeight w:val="439"/>
           <w:jc w:val="center"/>
         </w:trPr>
         <w:tc>
           <w:tcPr>
-            <w:tcW w:w="3402" w:type="dxa"/>
+            <w:tcW w:w="3820" w:type="dxa"/>
             <w:tcMar>
               <w:top w:w="70" w:type="dxa"/>
               <w:left w:w="90" w:type="dxa"/>
@@ -1849,13 +2244,16 @@
               <w:spacing w:after="0" w:line="240" w:lineRule="auto"/>
             </w:pPr>
             <w:r>
-              <w:t>GET /api/dashboard</w:t>
+              <w:t>GET /api/</w:t>
+            </w:r>
+            <w:r>
+              <w:t>dashboard/history/chunk</w:t>
             </w:r>
           </w:p>
         </w:tc>
         <w:tc>
           <w:tcPr>
-            <w:tcW w:w="4139" w:type="dxa"/>
+            <w:tcW w:w="4114" w:type="dxa"/>
             <w:tcMar>
               <w:top w:w="70" w:type="dxa"/>
               <w:left w:w="90" w:type="dxa"/>
@@ -1869,13 +2267,384 @@
               <w:spacing w:after="0" w:line="240" w:lineRule="auto"/>
             </w:pPr>
             <w:r>
-              <w:t>Aktuelle Daten für das Dashboard</w:t>
+              <w:t>Historische Messwerte nach Zeitraum liefern</w:t>
             </w:r>
           </w:p>
         </w:tc>
         <w:tc>
           <w:tcPr>
-            <w:tcW w:w="1757" w:type="dxa"/>
+            <w:tcW w:w="1981" w:type="dxa"/>
+            <w:tcMar>
+              <w:top w:w="70" w:type="dxa"/>
+              <w:left w:w="90" w:type="dxa"/>
+              <w:bottom w:w="70" w:type="dxa"/>
+              <w:right w:w="90" w:type="dxa"/>
+            </w:tcMar>
+            <w:vAlign w:val="center"/>
+          </w:tcPr>
+          <w:p>
+            <w:pPr>
+              <w:spacing w:after="0" w:line="240" w:lineRule="auto"/>
+            </w:pPr>
+            <w:r>
+              <w:t>geplant</w:t>
+            </w:r>
+          </w:p>
+        </w:tc>
+      </w:tr>
+      <w:tr>
+        <w:trPr>
+          <w:cantSplit/>
+          <w:trHeight w:val="349"/>
+          <w:jc w:val="center"/>
+        </w:trPr>
+        <w:tc>
+          <w:tcPr>
+            <w:tcW w:w="3820" w:type="dxa"/>
+            <w:tcMar>
+              <w:top w:w="70" w:type="dxa"/>
+              <w:left w:w="90" w:type="dxa"/>
+              <w:bottom w:w="70" w:type="dxa"/>
+              <w:right w:w="90" w:type="dxa"/>
+            </w:tcMar>
+            <w:vAlign w:val="center"/>
+          </w:tcPr>
+          <w:p>
+            <w:pPr>
+              <w:spacing w:after="0" w:line="240" w:lineRule="auto"/>
+            </w:pPr>
+            <w:r>
+              <w:t>GET /api/beds/{bed_</w:t>
+            </w:r>
+            <w:proofErr w:type="gramStart"/>
+            <w:r>
+              <w:t>name}/</w:t>
+            </w:r>
+            <w:proofErr w:type="gramEnd"/>
+            <w:r>
+              <w:t>history</w:t>
+            </w:r>
+          </w:p>
+        </w:tc>
+        <w:tc>
+          <w:tcPr>
+            <w:tcW w:w="4114" w:type="dxa"/>
+            <w:tcMar>
+              <w:top w:w="70" w:type="dxa"/>
+              <w:left w:w="90" w:type="dxa"/>
+              <w:bottom w:w="70" w:type="dxa"/>
+              <w:right w:w="90" w:type="dxa"/>
+            </w:tcMar>
+            <w:vAlign w:val="center"/>
+          </w:tcPr>
+          <w:p>
+            <w:pPr>
+              <w:spacing w:after="0" w:line="240" w:lineRule="auto"/>
+            </w:pPr>
+            <w:r>
+              <w:t>Historie eines Beetes</w:t>
+            </w:r>
+          </w:p>
+        </w:tc>
+        <w:tc>
+          <w:tcPr>
+            <w:tcW w:w="1981" w:type="dxa"/>
+            <w:tcMar>
+              <w:top w:w="70" w:type="dxa"/>
+              <w:left w:w="90" w:type="dxa"/>
+              <w:bottom w:w="70" w:type="dxa"/>
+              <w:right w:w="90" w:type="dxa"/>
+            </w:tcMar>
+            <w:vAlign w:val="center"/>
+          </w:tcPr>
+          <w:p>
+            <w:pPr>
+              <w:spacing w:after="0" w:line="240" w:lineRule="auto"/>
+            </w:pPr>
+            <w:r>
+              <w:t>v</w:t>
+            </w:r>
+            <w:r>
+              <w:t>orhanden</w:t>
+            </w:r>
+          </w:p>
+        </w:tc>
+      </w:tr>
+      <w:tr>
+        <w:trPr>
+          <w:cantSplit/>
+          <w:trHeight w:val="525"/>
+          <w:jc w:val="center"/>
+        </w:trPr>
+        <w:tc>
+          <w:tcPr>
+            <w:tcW w:w="3820" w:type="dxa"/>
+            <w:tcMar>
+              <w:top w:w="70" w:type="dxa"/>
+              <w:left w:w="90" w:type="dxa"/>
+              <w:bottom w:w="70" w:type="dxa"/>
+              <w:right w:w="90" w:type="dxa"/>
+            </w:tcMar>
+            <w:vAlign w:val="center"/>
+          </w:tcPr>
+          <w:p>
+            <w:pPr>
+              <w:spacing w:after="0" w:line="240" w:lineRule="auto"/>
+            </w:pPr>
+            <w:r>
+              <w:t>GET /api/beds/{bed_</w:t>
+            </w:r>
+            <w:proofErr w:type="gramStart"/>
+            <w:r>
+              <w:t>name}/</w:t>
+            </w:r>
+            <w:proofErr w:type="gramEnd"/>
+            <w:r>
+              <w:t>{bed_</w:t>
+            </w:r>
+            <w:proofErr w:type="gramStart"/>
+            <w:r>
+              <w:t>position}/</w:t>
+            </w:r>
+            <w:proofErr w:type="gramEnd"/>
+            <w:r>
+              <w:t>history</w:t>
+            </w:r>
+          </w:p>
+        </w:tc>
+        <w:tc>
+          <w:tcPr>
+            <w:tcW w:w="4114" w:type="dxa"/>
+            <w:tcMar>
+              <w:top w:w="70" w:type="dxa"/>
+              <w:left w:w="90" w:type="dxa"/>
+              <w:bottom w:w="70" w:type="dxa"/>
+              <w:right w:w="90" w:type="dxa"/>
+            </w:tcMar>
+            <w:vAlign w:val="center"/>
+          </w:tcPr>
+          <w:p>
+            <w:pPr>
+              <w:spacing w:after="0" w:line="240" w:lineRule="auto"/>
+            </w:pPr>
+            <w:r>
+              <w:t>Historie einer Messstelle</w:t>
+            </w:r>
+          </w:p>
+        </w:tc>
+        <w:tc>
+          <w:tcPr>
+            <w:tcW w:w="1981" w:type="dxa"/>
+            <w:tcMar>
+              <w:top w:w="70" w:type="dxa"/>
+              <w:left w:w="90" w:type="dxa"/>
+              <w:bottom w:w="70" w:type="dxa"/>
+              <w:right w:w="90" w:type="dxa"/>
+            </w:tcMar>
+            <w:vAlign w:val="center"/>
+          </w:tcPr>
+          <w:p>
+            <w:pPr>
+              <w:spacing w:after="0" w:line="240" w:lineRule="auto"/>
+            </w:pPr>
+            <w:r>
+              <w:t>v</w:t>
+            </w:r>
+            <w:r>
+              <w:t>orhanden</w:t>
+            </w:r>
+          </w:p>
+        </w:tc>
+      </w:tr>
+      <w:tr>
+        <w:trPr>
+          <w:cantSplit/>
+          <w:trHeight w:val="341"/>
+          <w:jc w:val="center"/>
+        </w:trPr>
+        <w:tc>
+          <w:tcPr>
+            <w:tcW w:w="3820" w:type="dxa"/>
+            <w:tcMar>
+              <w:top w:w="70" w:type="dxa"/>
+              <w:left w:w="90" w:type="dxa"/>
+              <w:bottom w:w="70" w:type="dxa"/>
+              <w:right w:w="90" w:type="dxa"/>
+            </w:tcMar>
+            <w:vAlign w:val="center"/>
+          </w:tcPr>
+          <w:p>
+            <w:pPr>
+              <w:spacing w:after="0" w:line="240" w:lineRule="auto"/>
+            </w:pPr>
+            <w:r>
+              <w:t>POST /api/auth/login</w:t>
+            </w:r>
+          </w:p>
+        </w:tc>
+        <w:tc>
+          <w:tcPr>
+            <w:tcW w:w="4114" w:type="dxa"/>
+            <w:tcMar>
+              <w:top w:w="70" w:type="dxa"/>
+              <w:left w:w="90" w:type="dxa"/>
+              <w:bottom w:w="70" w:type="dxa"/>
+              <w:right w:w="90" w:type="dxa"/>
+            </w:tcMar>
+            <w:vAlign w:val="center"/>
+          </w:tcPr>
+          <w:p>
+            <w:pPr>
+              <w:spacing w:after="0" w:line="240" w:lineRule="auto"/>
+            </w:pPr>
+            <w:r>
+              <w:t>Benutzer anmelden</w:t>
+            </w:r>
+          </w:p>
+        </w:tc>
+        <w:tc>
+          <w:tcPr>
+            <w:tcW w:w="1981" w:type="dxa"/>
+            <w:tcMar>
+              <w:top w:w="70" w:type="dxa"/>
+              <w:left w:w="90" w:type="dxa"/>
+              <w:bottom w:w="70" w:type="dxa"/>
+              <w:right w:w="90" w:type="dxa"/>
+            </w:tcMar>
+            <w:vAlign w:val="center"/>
+          </w:tcPr>
+          <w:p>
+            <w:pPr>
+              <w:spacing w:after="0" w:line="240" w:lineRule="auto"/>
+            </w:pPr>
+            <w:r>
+              <w:t>v</w:t>
+            </w:r>
+            <w:r>
+              <w:t>orhanden</w:t>
+            </w:r>
+          </w:p>
+        </w:tc>
+      </w:tr>
+      <w:tr>
+        <w:trPr>
+          <w:cantSplit/>
+          <w:trHeight w:val="525"/>
+          <w:jc w:val="center"/>
+        </w:trPr>
+        <w:tc>
+          <w:tcPr>
+            <w:tcW w:w="3820" w:type="dxa"/>
+            <w:tcMar>
+              <w:top w:w="70" w:type="dxa"/>
+              <w:left w:w="90" w:type="dxa"/>
+              <w:bottom w:w="70" w:type="dxa"/>
+              <w:right w:w="90" w:type="dxa"/>
+            </w:tcMar>
+            <w:vAlign w:val="center"/>
+          </w:tcPr>
+          <w:p>
+            <w:pPr>
+              <w:spacing w:after="0" w:line="240" w:lineRule="auto"/>
+            </w:pPr>
+            <w:r>
+              <w:t>POST /api/auth/logout</w:t>
+            </w:r>
+          </w:p>
+        </w:tc>
+        <w:tc>
+          <w:tcPr>
+            <w:tcW w:w="4114" w:type="dxa"/>
+            <w:tcMar>
+              <w:top w:w="70" w:type="dxa"/>
+              <w:left w:w="90" w:type="dxa"/>
+              <w:bottom w:w="70" w:type="dxa"/>
+              <w:right w:w="90" w:type="dxa"/>
+            </w:tcMar>
+            <w:vAlign w:val="center"/>
+          </w:tcPr>
+          <w:p>
+            <w:pPr>
+              <w:spacing w:after="0" w:line="240" w:lineRule="auto"/>
+            </w:pPr>
+            <w:r>
+              <w:t>Benutzer abmelden</w:t>
+            </w:r>
+          </w:p>
+        </w:tc>
+        <w:tc>
+          <w:tcPr>
+            <w:tcW w:w="1981" w:type="dxa"/>
+            <w:tcMar>
+              <w:top w:w="70" w:type="dxa"/>
+              <w:left w:w="90" w:type="dxa"/>
+              <w:bottom w:w="70" w:type="dxa"/>
+              <w:right w:w="90" w:type="dxa"/>
+            </w:tcMar>
+            <w:vAlign w:val="center"/>
+          </w:tcPr>
+          <w:p>
+            <w:pPr>
+              <w:spacing w:after="0" w:line="240" w:lineRule="auto"/>
+            </w:pPr>
+            <w:r>
+              <w:t>v</w:t>
+            </w:r>
+            <w:r>
+              <w:t>orhanden</w:t>
+            </w:r>
+          </w:p>
+        </w:tc>
+      </w:tr>
+      <w:tr>
+        <w:trPr>
+          <w:cantSplit/>
+          <w:trHeight w:val="423"/>
+          <w:jc w:val="center"/>
+        </w:trPr>
+        <w:tc>
+          <w:tcPr>
+            <w:tcW w:w="3820" w:type="dxa"/>
+            <w:tcMar>
+              <w:top w:w="70" w:type="dxa"/>
+              <w:left w:w="90" w:type="dxa"/>
+              <w:bottom w:w="70" w:type="dxa"/>
+              <w:right w:w="90" w:type="dxa"/>
+            </w:tcMar>
+            <w:vAlign w:val="center"/>
+          </w:tcPr>
+          <w:p>
+            <w:pPr>
+              <w:spacing w:after="0" w:line="240" w:lineRule="auto"/>
+            </w:pPr>
+            <w:r>
+              <w:t>GET /api/auth/me</w:t>
+            </w:r>
+          </w:p>
+        </w:tc>
+        <w:tc>
+          <w:tcPr>
+            <w:tcW w:w="4114" w:type="dxa"/>
+            <w:tcMar>
+              <w:top w:w="70" w:type="dxa"/>
+              <w:left w:w="90" w:type="dxa"/>
+              <w:bottom w:w="70" w:type="dxa"/>
+              <w:right w:w="90" w:type="dxa"/>
+            </w:tcMar>
+            <w:vAlign w:val="center"/>
+          </w:tcPr>
+          <w:p>
+            <w:pPr>
+              <w:spacing w:after="0" w:line="240" w:lineRule="auto"/>
+            </w:pPr>
+            <w:r>
+              <w:t>Anmeldestatus prüfen</w:t>
+            </w:r>
+          </w:p>
+        </w:tc>
+        <w:tc>
+          <w:tcPr>
+            <w:tcW w:w="1981" w:type="dxa"/>
             <w:tcMar>
               <w:top w:w="70" w:type="dxa"/>
               <w:left w:w="90" w:type="dxa"/>
@@ -1897,77 +2666,12 @@
       <w:tr>
         <w:trPr>
           <w:cantSplit/>
+          <w:trHeight w:val="525"/>
           <w:jc w:val="center"/>
         </w:trPr>
         <w:tc>
           <w:tcPr>
-            <w:tcW w:w="3402" w:type="dxa"/>
-            <w:tcMar>
-              <w:top w:w="70" w:type="dxa"/>
-              <w:left w:w="90" w:type="dxa"/>
-              <w:bottom w:w="70" w:type="dxa"/>
-              <w:right w:w="90" w:type="dxa"/>
-            </w:tcMar>
-            <w:vAlign w:val="center"/>
-          </w:tcPr>
-          <w:p>
-            <w:pPr>
-              <w:spacing w:after="0" w:line="240" w:lineRule="auto"/>
-            </w:pPr>
-            <w:r>
-              <w:t>GET /api/history</w:t>
-            </w:r>
-          </w:p>
-        </w:tc>
-        <w:tc>
-          <w:tcPr>
-            <w:tcW w:w="4139" w:type="dxa"/>
-            <w:tcMar>
-              <w:top w:w="70" w:type="dxa"/>
-              <w:left w:w="90" w:type="dxa"/>
-              <w:bottom w:w="70" w:type="dxa"/>
-              <w:right w:w="90" w:type="dxa"/>
-            </w:tcMar>
-            <w:vAlign w:val="center"/>
-          </w:tcPr>
-          <w:p>
-            <w:pPr>
-              <w:spacing w:after="0" w:line="240" w:lineRule="auto"/>
-            </w:pPr>
-            <w:r>
-              <w:t>Historische Messwerte nach Zeitraum liefern</w:t>
-            </w:r>
-          </w:p>
-        </w:tc>
-        <w:tc>
-          <w:tcPr>
-            <w:tcW w:w="1757" w:type="dxa"/>
-            <w:tcMar>
-              <w:top w:w="70" w:type="dxa"/>
-              <w:left w:w="90" w:type="dxa"/>
-              <w:bottom w:w="70" w:type="dxa"/>
-              <w:right w:w="90" w:type="dxa"/>
-            </w:tcMar>
-            <w:vAlign w:val="center"/>
-          </w:tcPr>
-          <w:p>
-            <w:pPr>
-              <w:spacing w:after="0" w:line="240" w:lineRule="auto"/>
-            </w:pPr>
-            <w:r>
-              <w:t>geplant</w:t>
-            </w:r>
-          </w:p>
-        </w:tc>
-      </w:tr>
-      <w:tr>
-        <w:trPr>
-          <w:cantSplit/>
-          <w:jc w:val="center"/>
-        </w:trPr>
-        <w:tc>
-          <w:tcPr>
-            <w:tcW w:w="3402" w:type="dxa"/>
+            <w:tcW w:w="3820" w:type="dxa"/>
             <w:tcMar>
               <w:top w:w="70" w:type="dxa"/>
               <w:left w:w="90" w:type="dxa"/>
@@ -1987,7 +2691,7 @@
         </w:tc>
         <w:tc>
           <w:tcPr>
-            <w:tcW w:w="4139" w:type="dxa"/>
+            <w:tcW w:w="4114" w:type="dxa"/>
             <w:tcMar>
               <w:top w:w="70" w:type="dxa"/>
               <w:left w:w="90" w:type="dxa"/>
@@ -2007,7 +2711,7 @@
         </w:tc>
         <w:tc>
           <w:tcPr>
-            <w:tcW w:w="1757" w:type="dxa"/>
+            <w:tcW w:w="1981" w:type="dxa"/>
             <w:tcMar>
               <w:top w:w="70" w:type="dxa"/>
               <w:left w:w="90" w:type="dxa"/>
@@ -2021,7 +2725,10 @@
               <w:spacing w:after="0" w:line="240" w:lineRule="auto"/>
             </w:pPr>
             <w:r>
-              <w:t>geplant</w:t>
+              <w:t>g</w:t>
+            </w:r>
+            <w:r>
+              <w:t>eplant</w:t>
             </w:r>
           </w:p>
         </w:tc>
@@ -2029,7 +2736,7 @@
     </w:tbl>
     <w:p>
       <w:pPr>
-        <w:spacing w:after="0"/>
+        <w:spacing w:after="0" w:line="240" w:lineRule="auto"/>
       </w:pPr>
     </w:p>
     <w:p>
@@ -2060,6 +2767,9 @@
       </w:r>
     </w:p>
     <w:p>
+      <w:pPr>
+        <w:spacing w:line="240" w:lineRule="auto"/>
+      </w:pPr>
       <w:r>
         <w:t>Das Backend besitzt eine Dockerfile und kann als Container betrieben werden. Im Container startet Uvicorn die FastAPI-Anwendung auf Port 8000. Der Server kann diesen Port anschließend nach außen weiterleiten.</w:t>
       </w:r>
@@ -2078,6 +2788,9 @@
       </w:r>
     </w:p>
     <w:p>
+      <w:pPr>
+        <w:spacing w:line="240" w:lineRule="auto"/>
+      </w:pPr>
       <w:r>
         <w:t>Das Frontend wird mit React, TypeScript und Vite gebaut. Die Adresse des Backends wird über VITE_API_URL gesetzt. Dadurch können Frontend und Backend getrennt betrieben werden.</w:t>
       </w:r>
@@ -2096,6 +2809,9 @@
       </w:r>
     </w:p>
     <w:p>
+      <w:pPr>
+        <w:spacing w:line="240" w:lineRule="auto"/>
+      </w:pPr>
       <w:r>
         <w:t>Für die lokale Entwicklung startet dev.py das Backend auf Port 8001 und das Frontend auf Port 5173.</w:t>
       </w:r>
@@ -2253,6 +2969,9 @@
             <w:r>
               <w:t>Frontend/src/</w:t>
             </w:r>
+            <w:r>
+              <w:t>pages/</w:t>
+            </w:r>
           </w:p>
         </w:tc>
         <w:tc>
@@ -2271,7 +2990,283 @@
               <w:spacing w:after="0" w:line="240" w:lineRule="auto"/>
             </w:pPr>
             <w:r>
-              <w:t>Landingpage, Dashboard, Komponenten, Datentypen und Beispieldaten</w:t>
+              <w:t>Landingpage, Login, interner Bereich, Datenfluss und Nele-Dashboard</w:t>
+            </w:r>
+          </w:p>
+        </w:tc>
+      </w:tr>
+      <w:tr>
+        <w:trPr>
+          <w:cantSplit/>
+          <w:jc w:val="center"/>
+        </w:trPr>
+        <w:tc>
+          <w:tcPr>
+            <w:tcW w:w="3402" w:type="dxa"/>
+            <w:tcMar>
+              <w:top w:w="70" w:type="dxa"/>
+              <w:left w:w="90" w:type="dxa"/>
+              <w:bottom w:w="70" w:type="dxa"/>
+              <w:right w:w="90" w:type="dxa"/>
+            </w:tcMar>
+            <w:vAlign w:val="center"/>
+          </w:tcPr>
+          <w:p>
+            <w:pPr>
+              <w:spacing w:after="0" w:line="240" w:lineRule="auto"/>
+            </w:pPr>
+            <w:r>
+              <w:t>Frontend/src/components/</w:t>
+            </w:r>
+          </w:p>
+        </w:tc>
+        <w:tc>
+          <w:tcPr>
+            <w:tcW w:w="5896" w:type="dxa"/>
+            <w:tcMar>
+              <w:top w:w="70" w:type="dxa"/>
+              <w:left w:w="90" w:type="dxa"/>
+              <w:bottom w:w="70" w:type="dxa"/>
+              <w:right w:w="90" w:type="dxa"/>
+            </w:tcMar>
+            <w:vAlign w:val="center"/>
+          </w:tcPr>
+          <w:p>
+            <w:pPr>
+              <w:spacing w:after="0" w:line="240" w:lineRule="auto"/>
+            </w:pPr>
+            <w:r>
+              <w:t>Wiederverwendbare Komponenten für Dashboard und Messwerte</w:t>
+            </w:r>
+          </w:p>
+        </w:tc>
+      </w:tr>
+      <w:tr>
+        <w:trPr>
+          <w:cantSplit/>
+          <w:jc w:val="center"/>
+        </w:trPr>
+        <w:tc>
+          <w:tcPr>
+            <w:tcW w:w="3402" w:type="dxa"/>
+            <w:tcMar>
+              <w:top w:w="70" w:type="dxa"/>
+              <w:left w:w="90" w:type="dxa"/>
+              <w:bottom w:w="70" w:type="dxa"/>
+              <w:right w:w="90" w:type="dxa"/>
+            </w:tcMar>
+            <w:vAlign w:val="center"/>
+          </w:tcPr>
+          <w:p>
+            <w:pPr>
+              <w:spacing w:after="0" w:line="240" w:lineRule="auto"/>
+            </w:pPr>
+            <w:r>
+              <w:t>Frontend/src/assets/</w:t>
+            </w:r>
+          </w:p>
+        </w:tc>
+        <w:tc>
+          <w:tcPr>
+            <w:tcW w:w="5896" w:type="dxa"/>
+            <w:tcMar>
+              <w:top w:w="70" w:type="dxa"/>
+              <w:left w:w="90" w:type="dxa"/>
+              <w:bottom w:w="70" w:type="dxa"/>
+              <w:right w:w="90" w:type="dxa"/>
+            </w:tcMar>
+            <w:vAlign w:val="center"/>
+          </w:tcPr>
+          <w:p>
+            <w:pPr>
+              <w:spacing w:after="0" w:line="240" w:lineRule="auto"/>
+            </w:pPr>
+            <w:r>
+              <w:t>Bilder, Logos und SVG-Icons</w:t>
+            </w:r>
+          </w:p>
+        </w:tc>
+      </w:tr>
+      <w:tr>
+        <w:trPr>
+          <w:cantSplit/>
+          <w:jc w:val="center"/>
+        </w:trPr>
+        <w:tc>
+          <w:tcPr>
+            <w:tcW w:w="3402" w:type="dxa"/>
+            <w:tcMar>
+              <w:top w:w="70" w:type="dxa"/>
+              <w:left w:w="90" w:type="dxa"/>
+              <w:bottom w:w="70" w:type="dxa"/>
+              <w:right w:w="90" w:type="dxa"/>
+            </w:tcMar>
+            <w:vAlign w:val="center"/>
+          </w:tcPr>
+          <w:p>
+            <w:pPr>
+              <w:spacing w:after="0" w:line="240" w:lineRule="auto"/>
+            </w:pPr>
+            <w:r>
+              <w:t>Frontend/src/api.ts</w:t>
+            </w:r>
+          </w:p>
+        </w:tc>
+        <w:tc>
+          <w:tcPr>
+            <w:tcW w:w="5896" w:type="dxa"/>
+            <w:tcMar>
+              <w:top w:w="70" w:type="dxa"/>
+              <w:left w:w="90" w:type="dxa"/>
+              <w:bottom w:w="70" w:type="dxa"/>
+              <w:right w:w="90" w:type="dxa"/>
+            </w:tcMar>
+            <w:vAlign w:val="center"/>
+          </w:tcPr>
+          <w:p>
+            <w:pPr>
+              <w:spacing w:after="0" w:line="240" w:lineRule="auto"/>
+            </w:pPr>
+            <w:r>
+              <w:t>API-Abfragen und Authentifizierung</w:t>
+            </w:r>
+          </w:p>
+        </w:tc>
+      </w:tr>
+      <w:tr>
+        <w:trPr>
+          <w:cantSplit/>
+          <w:jc w:val="center"/>
+        </w:trPr>
+        <w:tc>
+          <w:tcPr>
+            <w:tcW w:w="3402" w:type="dxa"/>
+            <w:tcMar>
+              <w:top w:w="70" w:type="dxa"/>
+              <w:left w:w="90" w:type="dxa"/>
+              <w:bottom w:w="70" w:type="dxa"/>
+              <w:right w:w="90" w:type="dxa"/>
+            </w:tcMar>
+            <w:vAlign w:val="center"/>
+          </w:tcPr>
+          <w:p>
+            <w:pPr>
+              <w:spacing w:after="0" w:line="240" w:lineRule="auto"/>
+            </w:pPr>
+            <w:r>
+              <w:t>Frontend/src/utils/</w:t>
+            </w:r>
+          </w:p>
+        </w:tc>
+        <w:tc>
+          <w:tcPr>
+            <w:tcW w:w="5896" w:type="dxa"/>
+            <w:tcMar>
+              <w:top w:w="70" w:type="dxa"/>
+              <w:left w:w="90" w:type="dxa"/>
+              <w:bottom w:w="70" w:type="dxa"/>
+              <w:right w:w="90" w:type="dxa"/>
+            </w:tcMar>
+            <w:vAlign w:val="center"/>
+          </w:tcPr>
+          <w:p>
+            <w:pPr>
+              <w:spacing w:after="0" w:line="240" w:lineRule="auto"/>
+            </w:pPr>
+            <w:r>
+              <w:t>Hilfsfunktionen, unter anderem für historische Daten</w:t>
+            </w:r>
+          </w:p>
+        </w:tc>
+      </w:tr>
+      <w:tr>
+        <w:trPr>
+          <w:cantSplit/>
+          <w:jc w:val="center"/>
+        </w:trPr>
+        <w:tc>
+          <w:tcPr>
+            <w:tcW w:w="3402" w:type="dxa"/>
+            <w:tcMar>
+              <w:top w:w="70" w:type="dxa"/>
+              <w:left w:w="90" w:type="dxa"/>
+              <w:bottom w:w="70" w:type="dxa"/>
+              <w:right w:w="90" w:type="dxa"/>
+            </w:tcMar>
+            <w:vAlign w:val="center"/>
+          </w:tcPr>
+          <w:p>
+            <w:pPr>
+              <w:spacing w:after="0" w:line="240" w:lineRule="auto"/>
+            </w:pPr>
+            <w:r>
+              <w:t>Frontend/src/data/</w:t>
+            </w:r>
+          </w:p>
+        </w:tc>
+        <w:tc>
+          <w:tcPr>
+            <w:tcW w:w="5896" w:type="dxa"/>
+            <w:tcMar>
+              <w:top w:w="70" w:type="dxa"/>
+              <w:left w:w="90" w:type="dxa"/>
+              <w:bottom w:w="70" w:type="dxa"/>
+              <w:right w:w="90" w:type="dxa"/>
+            </w:tcMar>
+            <w:vAlign w:val="center"/>
+          </w:tcPr>
+          <w:p>
+            <w:pPr>
+              <w:spacing w:after="0" w:line="240" w:lineRule="auto"/>
+            </w:pPr>
+            <w:r>
+              <w:t>Beispieldaten</w:t>
+            </w:r>
+          </w:p>
+        </w:tc>
+      </w:tr>
+      <w:tr>
+        <w:trPr>
+          <w:cantSplit/>
+          <w:jc w:val="center"/>
+        </w:trPr>
+        <w:tc>
+          <w:tcPr>
+            <w:tcW w:w="3402" w:type="dxa"/>
+            <w:tcMar>
+              <w:top w:w="70" w:type="dxa"/>
+              <w:left w:w="90" w:type="dxa"/>
+              <w:bottom w:w="70" w:type="dxa"/>
+              <w:right w:w="90" w:type="dxa"/>
+            </w:tcMar>
+            <w:vAlign w:val="center"/>
+          </w:tcPr>
+          <w:p>
+            <w:pPr>
+              <w:spacing w:after="0" w:line="240" w:lineRule="auto"/>
+            </w:pPr>
+            <w:r>
+              <w:t>Frontend/src/types/</w:t>
+            </w:r>
+          </w:p>
+        </w:tc>
+        <w:tc>
+          <w:tcPr>
+            <w:tcW w:w="5896" w:type="dxa"/>
+            <w:tcMar>
+              <w:top w:w="70" w:type="dxa"/>
+              <w:left w:w="90" w:type="dxa"/>
+              <w:bottom w:w="70" w:type="dxa"/>
+              <w:right w:w="90" w:type="dxa"/>
+            </w:tcMar>
+            <w:vAlign w:val="center"/>
+          </w:tcPr>
+          <w:p>
+            <w:pPr>
+              <w:spacing w:after="0" w:line="240" w:lineRule="auto"/>
+            </w:pPr>
+            <w:r>
+              <w:t>TypeScript-Datentypen</w:t>
             </w:r>
           </w:p>
         </w:tc>
@@ -2343,7 +3338,7 @@
               <w:spacing w:after="0" w:line="240" w:lineRule="auto"/>
             </w:pPr>
             <w:r>
-              <w:t>Microcontroller</w:t>
+              <w:t>Sensorik/</w:t>
             </w:r>
           </w:p>
         </w:tc>
@@ -2363,7 +3358,54 @@
               <w:spacing w:after="0" w:line="240" w:lineRule="auto"/>
             </w:pPr>
             <w:r>
-              <w:t>Code des Sensor-Prototyps</w:t>
+              <w:t>ESP32-, Arduino- und Sensor-Prototypen</w:t>
+            </w:r>
+          </w:p>
+        </w:tc>
+      </w:tr>
+      <w:tr>
+        <w:trPr>
+          <w:cantSplit/>
+          <w:trHeight w:val="371"/>
+          <w:jc w:val="center"/>
+        </w:trPr>
+        <w:tc>
+          <w:tcPr>
+            <w:tcW w:w="3402" w:type="dxa"/>
+            <w:tcMar>
+              <w:top w:w="70" w:type="dxa"/>
+              <w:left w:w="90" w:type="dxa"/>
+              <w:bottom w:w="70" w:type="dxa"/>
+              <w:right w:w="90" w:type="dxa"/>
+            </w:tcMar>
+            <w:vAlign w:val="center"/>
+          </w:tcPr>
+          <w:p>
+            <w:pPr>
+              <w:spacing w:after="0" w:line="240" w:lineRule="auto"/>
+            </w:pPr>
+            <w:r>
+              <w:t>Planung/</w:t>
+            </w:r>
+          </w:p>
+        </w:tc>
+        <w:tc>
+          <w:tcPr>
+            <w:tcW w:w="5896" w:type="dxa"/>
+            <w:tcMar>
+              <w:top w:w="70" w:type="dxa"/>
+              <w:left w:w="90" w:type="dxa"/>
+              <w:bottom w:w="70" w:type="dxa"/>
+              <w:right w:w="90" w:type="dxa"/>
+            </w:tcMar>
+            <w:vAlign w:val="center"/>
+          </w:tcPr>
+          <w:p>
+            <w:pPr>
+              <w:spacing w:after="0" w:line="240" w:lineRule="auto"/>
+            </w:pPr>
+            <w:r>
+              <w:t>Pflichtenheft und Architekturdokumentation</w:t>
             </w:r>
           </w:p>
         </w:tc>
@@ -2371,7 +3413,7 @@
     </w:tbl>
     <w:p>
       <w:pPr>
-        <w:spacing w:after="0"/>
+        <w:spacing w:after="0" w:line="240" w:lineRule="auto"/>
       </w:pPr>
     </w:p>
     <w:p>
@@ -2389,7 +3431,7 @@
     </w:p>
     <w:p>
       <w:pPr>
-        <w:spacing w:after="60"/>
+        <w:spacing w:after="60" w:line="240" w:lineRule="auto"/>
         <w:ind w:left="312" w:hanging="181"/>
       </w:pPr>
       <w:r>
@@ -2398,7 +3440,7 @@
     </w:p>
     <w:p>
       <w:pPr>
-        <w:spacing w:after="60"/>
+        <w:spacing w:after="60" w:line="240" w:lineRule="auto"/>
         <w:ind w:left="312" w:hanging="181"/>
       </w:pPr>
       <w:r>
@@ -2407,34 +3449,11 @@
     </w:p>
     <w:p>
       <w:pPr>
-        <w:spacing w:after="60"/>
+        <w:spacing w:after="60" w:line="240" w:lineRule="auto"/>
         <w:ind w:left="312" w:hanging="181"/>
       </w:pPr>
       <w:r>
         <w:t>• Datenbank-Zugangsdaten und Tokens liegen serverseitig in Umgebungsvariablen bzw. der .env-Datei.</w:t>
-      </w:r>
-    </w:p>
-    <w:p>
-      <w:pPr>
-        <w:keepNext/>
-        <w:spacing w:before="280" w:after="160" w:line="240" w:lineRule="auto"/>
-      </w:pPr>
-      <w:r>
-        <w:rPr>
-          <w:b/>
-          <w:sz w:val="28"/>
-        </w:rPr>
-        <w:t>9. Aktueller Stand der Zielarchitektur</w:t>
-      </w:r>
-    </w:p>
-    <w:p>
-      <w:r>
-        <w:t>Der Abruf aktueller Messwerte aus der InfluxDB über FastAPI und DB-Connector ist bereits im Repository umgesetzt. Die historische Darstellung und die ML-Datenversorgung müssen noch auf denselben API-basierten Datenweg umgestellt bzw. ergänzt werden.</w:t>
-      </w:r>
-    </w:p>
-    <w:p>
-      <w:r>
-        <w:t>Damit ergibt sich als Ziel ein einheitlicher Aufbau: InfluxDB als zentrale Datenquelle, FastAPI als gemeinsame Schnittstelle und darauf aufbauend Frontend und ML. Grafana bleibt davon getrennt und wird nur für internes Monitoring verwendet.</w:t>
       </w:r>
     </w:p>
     <w:sectPr>
@@ -3101,7 +4120,7 @@
   <w:style w:type="paragraph" w:default="1" w:styleId="Standard">
     <w:name w:val="Normal"/>
     <w:qFormat/>
-    <w:rsid w:val="00FC693F"/>
+    <w:rsid w:val="001E10B8"/>
     <w:pPr>
       <w:spacing w:after="120"/>
     </w:pPr>
@@ -3322,7 +4341,6 @@
   <w:style w:type="character" w:default="1" w:styleId="Absatz-Standardschriftart">
     <w:name w:val="Default Paragraph Font"/>
     <w:uiPriority w:val="1"/>
-    <w:semiHidden/>
     <w:unhideWhenUsed/>
   </w:style>
   <w:style w:type="table" w:default="1" w:styleId="NormaleTabelle">
@@ -14092,6 +15110,19 @@
         <w:shd w:val="clear" w:color="auto" w:fill="FBCAA2" w:themeFill="accent6" w:themeFillTint="7F"/>
       </w:tcPr>
     </w:tblStylePr>
+  </w:style>
+  <w:style w:type="character" w:styleId="HTMLCode">
+    <w:name w:val="HTML Code"/>
+    <w:basedOn w:val="Absatz-Standardschriftart"/>
+    <w:uiPriority w:val="99"/>
+    <w:semiHidden/>
+    <w:unhideWhenUsed/>
+    <w:rsid w:val="0047496F"/>
+    <w:rPr>
+      <w:rFonts w:ascii="Courier New" w:eastAsia="Times New Roman" w:hAnsi="Courier New" w:cs="Courier New"/>
+      <w:sz w:val="20"/>
+      <w:szCs w:val="20"/>
+    </w:rPr>
   </w:style>
 </w:styles>
 </file>

</xml_diff>